<commit_message>
Tela de personagens e jogos concluidas
</commit_message>
<xml_diff>
--- a/Docuementação Projeto Individual - Leonardo Galfaro RA 03261012.docx
+++ b/Docuementação Projeto Individual - Leonardo Galfaro RA 03261012.docx
@@ -165,10 +165,11 @@
     </w:p>
     <w:p>
       <w:pPr>
-        <w:pStyle w:val="Ttulo2"/>
-      </w:pPr>
-      <w:r>
-        <w:t xml:space="preserve">Contexto: </w:t>
+        <w:pStyle w:val="Ttulo1"/>
+        <w:jc w:val="center"/>
+      </w:pPr>
+      <w:r>
+        <w:t>Contexto</w:t>
       </w:r>
     </w:p>
     <w:p/>
@@ -265,6 +266,53 @@
       <w:proofErr w:type="gramEnd"/>
       <w:r>
         <w:t xml:space="preserve"> representando as virtudes da Coragem, Sabedoria e Poder respectivamente.</w:t>
+      </w:r>
+    </w:p>
+    <w:p>
+      <w:pPr>
+        <w:spacing w:line="360" w:lineRule="auto"/>
+        <w:ind w:firstLine="708"/>
+        <w:jc w:val="both"/>
+      </w:pPr>
+      <w:r>
+        <w:t>Por fim, esse projeto busca valorizar minhas experiências com a franquia, mostrando como ela fez parte da minha vida em dos momentos mais difíceis da minha vida, também mostrando o impacto que uma franquia de um jogo pode causar na vida de alguém.</w:t>
+      </w:r>
+    </w:p>
+    <w:p>
+      <w:pPr>
+        <w:pStyle w:val="p1"/>
+      </w:pPr>
+      <w:r>
+        <w:br w:type="page"/>
+      </w:r>
+    </w:p>
+    <w:p>
+      <w:pPr>
+        <w:pStyle w:val="Ttulo1"/>
+        <w:jc w:val="center"/>
+      </w:pPr>
+      <w:r>
+        <w:lastRenderedPageBreak/>
+        <w:t>Justificativa</w:t>
+      </w:r>
+    </w:p>
+    <w:p>
+      <w:pPr>
+        <w:pStyle w:val="p1"/>
+        <w:rPr>
+          <w:sz w:val="24"/>
+          <w:szCs w:val="24"/>
+        </w:rPr>
+      </w:pPr>
+    </w:p>
+    <w:p>
+      <w:pPr>
+        <w:spacing w:line="360" w:lineRule="auto"/>
+        <w:ind w:firstLine="708"/>
+        <w:jc w:val="both"/>
+      </w:pPr>
+      <w:r>
+        <w:t xml:space="preserve">O motivo da escolha desse tema foi </w:t>
       </w:r>
     </w:p>
     <w:p/>
@@ -1405,6 +1453,23 @@
     <w:unhideWhenUsed/>
     <w:rsid w:val="002D4E63"/>
   </w:style>
+  <w:style w:type="paragraph" w:customStyle="1" w:styleId="p1">
+    <w:name w:val="p1"/>
+    <w:basedOn w:val="Normal"/>
+    <w:rsid w:val="00D12065"/>
+    <w:pPr>
+      <w:spacing w:after="0" w:line="240" w:lineRule="auto"/>
+    </w:pPr>
+    <w:rPr>
+      <w:rFonts w:ascii="Helvetica" w:eastAsia="Times New Roman" w:hAnsi="Helvetica" w:cs="Times New Roman"/>
+      <w:color w:val="000000"/>
+      <w:kern w:val="0"/>
+      <w:sz w:val="21"/>
+      <w:szCs w:val="21"/>
+      <w:lang w:eastAsia="pt-BR"/>
+      <w14:ligatures w14:val="none"/>
+    </w:rPr>
+  </w:style>
 </w:styles>
 </file>
 

</xml_diff>